<commit_message>
Mise à jour des règles
</commit_message>
<xml_diff>
--- a/pictures/Memos/memos-fr.docx
+++ b/pictures/Memos/memos-fr.docx
@@ -14,7 +14,7 @@
         <mc:AlternateContent>
           <mc:Choice Requires="wpc">
             <w:drawing>
-              <wp:inline distT="0" distB="0" distL="0" distR="0" wp14:anchorId="3F35520E" wp14:editId="32F71F64">
+              <wp:inline distT="0" distB="0" distL="0" distR="0" wp14:anchorId="3F35520E" wp14:editId="155FD109">
                 <wp:extent cx="10276840" cy="7200900"/>
                 <wp:effectExtent l="0" t="0" r="0" b="0"/>
                 <wp:docPr id="1879269446" name="Zone de dessin 1"/>
@@ -32,11 +32,11 @@
                       </wpc:bg>
                       <wpc:whole/>
                       <wpg:wgp>
-                        <wpg:cNvPr id="1841248240" name="Groupe 1841248240"/>
+                        <wpg:cNvPr id="562816355" name="Groupe 562816355"/>
                         <wpg:cNvGrpSpPr/>
                         <wpg:grpSpPr>
                           <a:xfrm>
-                            <a:off x="489692" y="314326"/>
+                            <a:off x="655946" y="401744"/>
                             <a:ext cx="3960390" cy="3121564"/>
                             <a:chOff x="489692" y="314326"/>
                             <a:chExt cx="3960390" cy="3121564"/>
@@ -105,7 +105,7 @@
                           </pic:blipFill>
                           <pic:spPr bwMode="auto">
                             <a:xfrm>
-                              <a:off x="639847" y="451116"/>
+                              <a:off x="631592" y="451116"/>
                               <a:ext cx="3645535" cy="1839595"/>
                             </a:xfrm>
                             <a:prstGeom prst="rect">
@@ -194,7 +194,7 @@
                         </pic:pic>
                         <pic:pic xmlns:pic="http://schemas.openxmlformats.org/drawingml/2006/picture">
                           <pic:nvPicPr>
-                            <pic:cNvPr id="72853127" name="Image 72853127"/>
+                            <pic:cNvPr id="1674944933" name="Image 1674944933"/>
                             <pic:cNvPicPr>
                               <a:picLocks noChangeAspect="1"/>
                             </pic:cNvPicPr>
@@ -207,15 +207,15 @@
                                 </a:ext>
                               </a:extLst>
                             </a:blip>
-                            <a:srcRect l="35741" r="35742" b="25534"/>
+                            <a:srcRect l="35526" r="35585" b="24471"/>
                             <a:stretch>
                               <a:fillRect/>
                             </a:stretch>
                           </pic:blipFill>
                           <pic:spPr bwMode="auto">
                             <a:xfrm>
-                              <a:off x="640005" y="2423927"/>
-                              <a:ext cx="2944495" cy="862965"/>
+                              <a:off x="631490" y="2401523"/>
+                              <a:ext cx="2983230" cy="872490"/>
                             </a:xfrm>
                             <a:prstGeom prst="rect">
                               <a:avLst/>
@@ -233,18 +233,18 @@
                         </pic:pic>
                       </wpg:wgp>
                       <wpg:wgp>
-                        <wpg:cNvPr id="2130575211" name="Groupe 2130575211"/>
+                        <wpg:cNvPr id="1867465117" name="Groupe 1867465117"/>
                         <wpg:cNvGrpSpPr/>
                         <wpg:grpSpPr>
                           <a:xfrm>
-                            <a:off x="4745650" y="314326"/>
+                            <a:off x="4986198" y="401744"/>
                             <a:ext cx="3959860" cy="3121025"/>
                             <a:chOff x="0" y="0"/>
                             <a:chExt cx="3960390" cy="3121564"/>
                           </a:xfrm>
                         </wpg:grpSpPr>
                         <wps:wsp>
-                          <wps:cNvPr id="650922340" name="Rectangle 650922340"/>
+                          <wps:cNvPr id="727798100" name="Rectangle 727798100"/>
                           <wps:cNvSpPr/>
                           <wps:spPr>
                             <a:xfrm>
@@ -286,7 +286,7 @@
                         </wps:wsp>
                         <pic:pic xmlns:pic="http://schemas.openxmlformats.org/drawingml/2006/picture">
                           <pic:nvPicPr>
-                            <pic:cNvPr id="1497182814" name="Image 1497182814"/>
+                            <pic:cNvPr id="123798800" name="Image 123798800"/>
                             <pic:cNvPicPr>
                               <a:picLocks noChangeAspect="1"/>
                             </pic:cNvPicPr>
@@ -306,7 +306,7 @@
                           </pic:blipFill>
                           <pic:spPr bwMode="auto">
                             <a:xfrm>
-                              <a:off x="150155" y="136790"/>
+                              <a:off x="141900" y="136790"/>
                               <a:ext cx="3645535" cy="1839595"/>
                             </a:xfrm>
                             <a:prstGeom prst="rect">
@@ -325,7 +325,7 @@
                         </pic:pic>
                         <pic:pic xmlns:pic="http://schemas.openxmlformats.org/drawingml/2006/picture">
                           <pic:nvPicPr>
-                            <pic:cNvPr id="1796803993" name="Image 1796803993"/>
+                            <pic:cNvPr id="1707400807" name="Image 1707400807"/>
                             <pic:cNvPicPr>
                               <a:picLocks noChangeAspect="1"/>
                             </pic:cNvPicPr>
@@ -360,7 +360,7 @@
                         </pic:pic>
                         <pic:pic xmlns:pic="http://schemas.openxmlformats.org/drawingml/2006/picture">
                           <pic:nvPicPr>
-                            <pic:cNvPr id="1115001763" name="Image 1115001763"/>
+                            <pic:cNvPr id="1766203803" name="Image 1766203803"/>
                             <pic:cNvPicPr>
                               <a:picLocks noChangeAspect="1"/>
                             </pic:cNvPicPr>
@@ -395,7 +395,7 @@
                         </pic:pic>
                         <pic:pic xmlns:pic="http://schemas.openxmlformats.org/drawingml/2006/picture">
                           <pic:nvPicPr>
-                            <pic:cNvPr id="1222394338" name="Image 1222394338"/>
+                            <pic:cNvPr id="833253042" name="Image 833253042"/>
                             <pic:cNvPicPr>
                               <a:picLocks noChangeAspect="1"/>
                             </pic:cNvPicPr>
@@ -408,15 +408,15 @@
                                 </a:ext>
                               </a:extLst>
                             </a:blip>
-                            <a:srcRect l="35741" r="35742" b="25534"/>
+                            <a:srcRect l="35526" r="35585" b="24471"/>
                             <a:stretch>
                               <a:fillRect/>
                             </a:stretch>
                           </pic:blipFill>
                           <pic:spPr bwMode="auto">
                             <a:xfrm>
-                              <a:off x="150313" y="2109601"/>
-                              <a:ext cx="2944495" cy="862965"/>
+                              <a:off x="141798" y="2087197"/>
+                              <a:ext cx="2983230" cy="872490"/>
                             </a:xfrm>
                             <a:prstGeom prst="rect">
                               <a:avLst/>
@@ -434,18 +434,18 @@
                         </pic:pic>
                       </wpg:wgp>
                       <wpg:wgp>
-                        <wpg:cNvPr id="1557453790" name="Groupe 1557453790"/>
+                        <wpg:cNvPr id="1409561989" name="Groupe 1409561989"/>
                         <wpg:cNvGrpSpPr/>
                         <wpg:grpSpPr>
                           <a:xfrm>
-                            <a:off x="490222" y="3634400"/>
+                            <a:off x="656476" y="3681736"/>
                             <a:ext cx="3959860" cy="3121025"/>
                             <a:chOff x="0" y="0"/>
                             <a:chExt cx="3960390" cy="3121564"/>
                           </a:xfrm>
                         </wpg:grpSpPr>
                         <wps:wsp>
-                          <wps:cNvPr id="278827721" name="Rectangle 278827721"/>
+                          <wps:cNvPr id="1577563644" name="Rectangle 1577563644"/>
                           <wps:cNvSpPr/>
                           <wps:spPr>
                             <a:xfrm>
@@ -487,7 +487,7 @@
                         </wps:wsp>
                         <pic:pic xmlns:pic="http://schemas.openxmlformats.org/drawingml/2006/picture">
                           <pic:nvPicPr>
-                            <pic:cNvPr id="2132486792" name="Image 2132486792"/>
+                            <pic:cNvPr id="1745408490" name="Image 1745408490"/>
                             <pic:cNvPicPr>
                               <a:picLocks noChangeAspect="1"/>
                             </pic:cNvPicPr>
@@ -507,7 +507,7 @@
                           </pic:blipFill>
                           <pic:spPr bwMode="auto">
                             <a:xfrm>
-                              <a:off x="150155" y="136790"/>
+                              <a:off x="141900" y="136790"/>
                               <a:ext cx="3645535" cy="1839595"/>
                             </a:xfrm>
                             <a:prstGeom prst="rect">
@@ -526,7 +526,7 @@
                         </pic:pic>
                         <pic:pic xmlns:pic="http://schemas.openxmlformats.org/drawingml/2006/picture">
                           <pic:nvPicPr>
-                            <pic:cNvPr id="325094628" name="Image 325094628"/>
+                            <pic:cNvPr id="1304375466" name="Image 1304375466"/>
                             <pic:cNvPicPr>
                               <a:picLocks noChangeAspect="1"/>
                             </pic:cNvPicPr>
@@ -561,7 +561,7 @@
                         </pic:pic>
                         <pic:pic xmlns:pic="http://schemas.openxmlformats.org/drawingml/2006/picture">
                           <pic:nvPicPr>
-                            <pic:cNvPr id="1348610929" name="Image 1348610929"/>
+                            <pic:cNvPr id="2078628494" name="Image 2078628494"/>
                             <pic:cNvPicPr>
                               <a:picLocks noChangeAspect="1"/>
                             </pic:cNvPicPr>
@@ -596,7 +596,7 @@
                         </pic:pic>
                         <pic:pic xmlns:pic="http://schemas.openxmlformats.org/drawingml/2006/picture">
                           <pic:nvPicPr>
-                            <pic:cNvPr id="995971405" name="Image 995971405"/>
+                            <pic:cNvPr id="2076241946" name="Image 2076241946"/>
                             <pic:cNvPicPr>
                               <a:picLocks noChangeAspect="1"/>
                             </pic:cNvPicPr>
@@ -609,15 +609,15 @@
                                 </a:ext>
                               </a:extLst>
                             </a:blip>
-                            <a:srcRect l="35741" r="35742" b="25534"/>
+                            <a:srcRect l="35526" r="35585" b="24471"/>
                             <a:stretch>
                               <a:fillRect/>
                             </a:stretch>
                           </pic:blipFill>
                           <pic:spPr bwMode="auto">
                             <a:xfrm>
-                              <a:off x="150313" y="2109601"/>
-                              <a:ext cx="2944495" cy="862965"/>
+                              <a:off x="141798" y="2087197"/>
+                              <a:ext cx="2983230" cy="872490"/>
                             </a:xfrm>
                             <a:prstGeom prst="rect">
                               <a:avLst/>
@@ -635,18 +635,18 @@
                         </pic:pic>
                       </wpg:wgp>
                       <wpg:wgp>
-                        <wpg:cNvPr id="2146968744" name="Groupe 2146968744"/>
+                        <wpg:cNvPr id="1566720209" name="Groupe 1566720209"/>
                         <wpg:cNvGrpSpPr/>
                         <wpg:grpSpPr>
                           <a:xfrm>
-                            <a:off x="4739300" y="3634400"/>
+                            <a:off x="4996589" y="3681736"/>
                             <a:ext cx="3959860" cy="3121025"/>
                             <a:chOff x="0" y="0"/>
                             <a:chExt cx="3960390" cy="3121564"/>
                           </a:xfrm>
                         </wpg:grpSpPr>
                         <wps:wsp>
-                          <wps:cNvPr id="1014385354" name="Rectangle 1014385354"/>
+                          <wps:cNvPr id="1919753086" name="Rectangle 1919753086"/>
                           <wps:cNvSpPr/>
                           <wps:spPr>
                             <a:xfrm>
@@ -688,7 +688,7 @@
                         </wps:wsp>
                         <pic:pic xmlns:pic="http://schemas.openxmlformats.org/drawingml/2006/picture">
                           <pic:nvPicPr>
-                            <pic:cNvPr id="1679876490" name="Image 1679876490"/>
+                            <pic:cNvPr id="1224332929" name="Image 1224332929"/>
                             <pic:cNvPicPr>
                               <a:picLocks noChangeAspect="1"/>
                             </pic:cNvPicPr>
@@ -708,7 +708,7 @@
                           </pic:blipFill>
                           <pic:spPr bwMode="auto">
                             <a:xfrm>
-                              <a:off x="150155" y="136790"/>
+                              <a:off x="141900" y="136790"/>
                               <a:ext cx="3645535" cy="1839595"/>
                             </a:xfrm>
                             <a:prstGeom prst="rect">
@@ -727,7 +727,7 @@
                         </pic:pic>
                         <pic:pic xmlns:pic="http://schemas.openxmlformats.org/drawingml/2006/picture">
                           <pic:nvPicPr>
-                            <pic:cNvPr id="1511511444" name="Image 1511511444"/>
+                            <pic:cNvPr id="2081353947" name="Image 2081353947"/>
                             <pic:cNvPicPr>
                               <a:picLocks noChangeAspect="1"/>
                             </pic:cNvPicPr>
@@ -762,7 +762,7 @@
                         </pic:pic>
                         <pic:pic xmlns:pic="http://schemas.openxmlformats.org/drawingml/2006/picture">
                           <pic:nvPicPr>
-                            <pic:cNvPr id="1708396343" name="Image 1708396343"/>
+                            <pic:cNvPr id="154776276" name="Image 154776276"/>
                             <pic:cNvPicPr>
                               <a:picLocks noChangeAspect="1"/>
                             </pic:cNvPicPr>
@@ -797,7 +797,7 @@
                         </pic:pic>
                         <pic:pic xmlns:pic="http://schemas.openxmlformats.org/drawingml/2006/picture">
                           <pic:nvPicPr>
-                            <pic:cNvPr id="904778424" name="Image 904778424"/>
+                            <pic:cNvPr id="391715152" name="Image 391715152"/>
                             <pic:cNvPicPr>
                               <a:picLocks noChangeAspect="1"/>
                             </pic:cNvPicPr>
@@ -810,15 +810,15 @@
                                 </a:ext>
                               </a:extLst>
                             </a:blip>
-                            <a:srcRect l="35741" r="35742" b="25534"/>
+                            <a:srcRect l="35526" r="35585" b="24471"/>
                             <a:stretch>
                               <a:fillRect/>
                             </a:stretch>
                           </pic:blipFill>
                           <pic:spPr bwMode="auto">
                             <a:xfrm>
-                              <a:off x="150313" y="2109601"/>
-                              <a:ext cx="2944495" cy="862965"/>
+                              <a:off x="141798" y="2087197"/>
+                              <a:ext cx="2983230" cy="872490"/>
                             </a:xfrm>
                             <a:prstGeom prst="rect">
                               <a:avLst/>
@@ -843,7 +843,7 @@
           </mc:Choice>
           <mc:Fallback>
             <w:pict>
-              <v:group w14:anchorId="42D7F5FE" id="Zone de dessin 1" o:spid="_x0000_s1026" editas="canvas" style="width:809.2pt;height:567pt;mso-position-horizontal-relative:char;mso-position-vertical-relative:line" coordsize="102768,72009" o:gfxdata="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">
+              <v:group w14:anchorId="1503CAA9" id="Zone de dessin 1" o:spid="_x0000_s1026" editas="canvas" style="width:809.2pt;height:567pt;mso-position-horizontal-relative:char;mso-position-vertical-relative:line" coordsize="102768,72009" o:gfxdata="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">
                 <v:shapetype id="_x0000_t75" coordsize="21600,21600" o:spt="75" o:preferrelative="t" path="m@4@5l@4@11@9@11@9@5xe" filled="f" stroked="f">
                   <v:stroke joinstyle="miter"/>
                   <v:formulas>
@@ -867,9 +867,9 @@
                   <v:fill r:id="rId10" o:title="" recolor="t" rotate="t" o:detectmouseclick="t" type="tile"/>
                   <v:path o:connecttype="none"/>
                 </v:shape>
-                <v:group id="Groupe 1841248240" o:spid="_x0000_s1028" style="position:absolute;left:4896;top:3143;width:39604;height:31215" coordorigin="4896,3143" coordsize="39603,31215" o:gfxdata="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">
+                <v:group id="Groupe 562816355" o:spid="_x0000_s1028" style="position:absolute;left:6559;top:4017;width:39604;height:31216" coordorigin="4896,3143" coordsize="39603,31215" o:gfxdata="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">
                   <v:rect id="Rectangle 1903031763" o:spid="_x0000_s1029" style="position:absolute;left:4896;top:3143;width:39604;height:31215;visibility:visible;mso-wrap-style:square;v-text-anchor:middle" o:gfxdata="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" filled="f" strokecolor="white [3212]" strokeweight="1pt"/>
-                  <v:shape id="Image 1863099039" o:spid="_x0000_s1030" type="#_x0000_t75" style="position:absolute;left:6398;top:4511;width:36455;height:18396;visibility:visible;mso-wrap-style:square" o:gfxdata="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">
+                  <v:shape id="Image 1863099039" o:spid="_x0000_s1030" type="#_x0000_t75" style="position:absolute;left:6315;top:4511;width:36456;height:18396;visibility:visible;mso-wrap-style:square" o:gfxdata="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">
                     <v:imagedata r:id="rId11" o:title="" cropbottom="8947f" cropleft="21173f" cropright="21229f"/>
                   </v:shape>
                   <v:shape id="Image 1455474112" o:spid="_x0000_s1031" type="#_x0000_t75" style="position:absolute;left:36147;top:24936;width:7200;height:7200;visibility:visible;mso-wrap-style:square" o:gfxdata="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">
@@ -878,53 +878,53 @@
                   <v:shape id="Image 976715722" o:spid="_x0000_s1032" type="#_x0000_t75" style="position:absolute;left:6815;top:4017;width:7200;height:7200;flip:x;visibility:visible;mso-wrap-style:square" o:gfxdata="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">
                     <v:imagedata r:id="rId12" o:title="" gain="19661f" blacklevel="22938f"/>
                   </v:shape>
-                  <v:shape id="Image 72853127" o:spid="_x0000_s1033" type="#_x0000_t75" style="position:absolute;left:6400;top:24239;width:29445;height:8629;visibility:visible;mso-wrap-style:square" o:gfxdata="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">
-                    <v:imagedata r:id="rId13" o:title="" cropbottom="16734f" cropleft="23423f" cropright="23424f"/>
+                  <v:shape id="Image 1674944933" o:spid="_x0000_s1033" type="#_x0000_t75" style="position:absolute;left:6314;top:24015;width:29833;height:8725;visibility:visible;mso-wrap-style:square" o:gfxdata="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">
+                    <v:imagedata r:id="rId13" o:title="" cropbottom="16037f" cropleft="23282f" cropright="23321f"/>
                   </v:shape>
                 </v:group>
-                <v:group id="Groupe 2130575211" o:spid="_x0000_s1034" style="position:absolute;left:47456;top:3143;width:39599;height:31210" coordsize="39603,31215" o:gfxdata="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">
-                  <v:rect id="Rectangle 650922340" o:spid="_x0000_s1035" style="position:absolute;width:39603;height:31215;visibility:visible;mso-wrap-style:square;v-text-anchor:middle" o:gfxdata="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" filled="f" strokecolor="white [3212]" strokeweight="1pt"/>
-                  <v:shape id="Image 1497182814" o:spid="_x0000_s1036" type="#_x0000_t75" style="position:absolute;left:1501;top:1367;width:36455;height:18396;visibility:visible;mso-wrap-style:square" o:gfxdata="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">
+                <v:group id="Groupe 1867465117" o:spid="_x0000_s1034" style="position:absolute;left:49861;top:4017;width:39599;height:31210" coordsize="39603,31215" o:gfxdata="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">
+                  <v:rect id="Rectangle 727798100" o:spid="_x0000_s1035" style="position:absolute;width:39603;height:31215;visibility:visible;mso-wrap-style:square;v-text-anchor:middle" o:gfxdata="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" filled="f" strokecolor="white [3212]" strokeweight="1pt"/>
+                  <v:shape id="Image 123798800" o:spid="_x0000_s1036" type="#_x0000_t75" style="position:absolute;left:1419;top:1367;width:36455;height:18396;visibility:visible;mso-wrap-style:square" o:gfxdata="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">
                     <v:imagedata r:id="rId11" o:title="" cropbottom="8947f" cropleft="21173f" cropright="21229f"/>
                   </v:shape>
-                  <v:shape id="Image 1796803993" o:spid="_x0000_s1037" type="#_x0000_t75" style="position:absolute;left:31250;top:21793;width:7200;height:7200;visibility:visible;mso-wrap-style:square" o:gfxdata="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">
+                  <v:shape id="Image 1707400807" o:spid="_x0000_s1037" type="#_x0000_t75" style="position:absolute;left:31250;top:21793;width:7200;height:7200;visibility:visible;mso-wrap-style:square" o:gfxdata="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">
                     <v:imagedata r:id="rId12" o:title="" gain="19661f" blacklevel="22938f"/>
                   </v:shape>
-                  <v:shape id="Image 1115001763" o:spid="_x0000_s1038" type="#_x0000_t75" style="position:absolute;left:1918;top:874;width:7200;height:7200;flip:x;visibility:visible;mso-wrap-style:square" o:gfxdata="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">
+                  <v:shape id="Image 1766203803" o:spid="_x0000_s1038" type="#_x0000_t75" style="position:absolute;left:1918;top:874;width:7200;height:7200;flip:x;visibility:visible;mso-wrap-style:square" o:gfxdata="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">
                     <v:imagedata r:id="rId12" o:title="" gain="19661f" blacklevel="22938f"/>
                   </v:shape>
-                  <v:shape id="Image 1222394338" o:spid="_x0000_s1039" type="#_x0000_t75" style="position:absolute;left:1503;top:21096;width:29445;height:8629;visibility:visible;mso-wrap-style:square" o:gfxdata="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">
-                    <v:imagedata r:id="rId13" o:title="" cropbottom="16734f" cropleft="23423f" cropright="23424f"/>
+                  <v:shape id="Image 833253042" o:spid="_x0000_s1039" type="#_x0000_t75" style="position:absolute;left:1417;top:20871;width:29833;height:8725;visibility:visible;mso-wrap-style:square" o:gfxdata="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">
+                    <v:imagedata r:id="rId13" o:title="" cropbottom="16037f" cropleft="23282f" cropright="23321f"/>
                   </v:shape>
                 </v:group>
-                <v:group id="Groupe 1557453790" o:spid="_x0000_s1040" style="position:absolute;left:4902;top:36344;width:39598;height:31210" coordsize="39603,31215" o:gfxdata="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">
-                  <v:rect id="Rectangle 278827721" o:spid="_x0000_s1041" style="position:absolute;width:39603;height:31215;visibility:visible;mso-wrap-style:square;v-text-anchor:middle" o:gfxdata="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" filled="f" strokecolor="white [3212]" strokeweight="1pt"/>
-                  <v:shape id="Image 2132486792" o:spid="_x0000_s1042" type="#_x0000_t75" style="position:absolute;left:1501;top:1367;width:36455;height:18396;visibility:visible;mso-wrap-style:square" o:gfxdata="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">
+                <v:group id="Groupe 1409561989" o:spid="_x0000_s1040" style="position:absolute;left:6564;top:36817;width:39599;height:31210" coordsize="39603,31215" o:gfxdata="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">
+                  <v:rect id="Rectangle 1577563644" o:spid="_x0000_s1041" style="position:absolute;width:39603;height:31215;visibility:visible;mso-wrap-style:square;v-text-anchor:middle" o:gfxdata="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" filled="f" strokecolor="white [3212]" strokeweight="1pt"/>
+                  <v:shape id="Image 1745408490" o:spid="_x0000_s1042" type="#_x0000_t75" style="position:absolute;left:1419;top:1367;width:36455;height:18396;visibility:visible;mso-wrap-style:square" o:gfxdata="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">
                     <v:imagedata r:id="rId11" o:title="" cropbottom="8947f" cropleft="21173f" cropright="21229f"/>
                   </v:shape>
-                  <v:shape id="Image 325094628" o:spid="_x0000_s1043" type="#_x0000_t75" style="position:absolute;left:31250;top:21793;width:7200;height:7200;visibility:visible;mso-wrap-style:square" o:gfxdata="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">
+                  <v:shape id="Image 1304375466" o:spid="_x0000_s1043" type="#_x0000_t75" style="position:absolute;left:31250;top:21793;width:7200;height:7200;visibility:visible;mso-wrap-style:square" o:gfxdata="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">
                     <v:imagedata r:id="rId12" o:title="" gain="19661f" blacklevel="22938f"/>
                   </v:shape>
-                  <v:shape id="Image 1348610929" o:spid="_x0000_s1044" type="#_x0000_t75" style="position:absolute;left:1918;top:874;width:7200;height:7200;flip:x;visibility:visible;mso-wrap-style:square" o:gfxdata="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">
+                  <v:shape id="Image 2078628494" o:spid="_x0000_s1044" type="#_x0000_t75" style="position:absolute;left:1918;top:874;width:7200;height:7200;flip:x;visibility:visible;mso-wrap-style:square" o:gfxdata="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">
                     <v:imagedata r:id="rId12" o:title="" gain="19661f" blacklevel="22938f"/>
                   </v:shape>
-                  <v:shape id="Image 995971405" o:spid="_x0000_s1045" type="#_x0000_t75" style="position:absolute;left:1503;top:21096;width:29445;height:8629;visibility:visible;mso-wrap-style:square" o:gfxdata="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">
-                    <v:imagedata r:id="rId13" o:title="" cropbottom="16734f" cropleft="23423f" cropright="23424f"/>
+                  <v:shape id="Image 2076241946" o:spid="_x0000_s1045" type="#_x0000_t75" style="position:absolute;left:1417;top:20871;width:29833;height:8725;visibility:visible;mso-wrap-style:square" o:gfxdata="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">
+                    <v:imagedata r:id="rId13" o:title="" cropbottom="16037f" cropleft="23282f" cropright="23321f"/>
                   </v:shape>
                 </v:group>
-                <v:group id="Groupe 2146968744" o:spid="_x0000_s1046" style="position:absolute;left:47393;top:36344;width:39598;height:31210" coordsize="39603,31215" o:gfxdata="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">
-                  <v:rect id="Rectangle 1014385354" o:spid="_x0000_s1047" style="position:absolute;width:39603;height:31215;visibility:visible;mso-wrap-style:square;v-text-anchor:middle" o:gfxdata="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" filled="f" strokecolor="white [3212]" strokeweight="1pt"/>
-                  <v:shape id="Image 1679876490" o:spid="_x0000_s1048" type="#_x0000_t75" style="position:absolute;left:1501;top:1367;width:36455;height:18396;visibility:visible;mso-wrap-style:square" o:gfxdata="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">
+                <v:group id="Groupe 1566720209" o:spid="_x0000_s1046" style="position:absolute;left:49965;top:36817;width:39599;height:31210" coordsize="39603,31215" o:gfxdata="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">
+                  <v:rect id="Rectangle 1919753086" o:spid="_x0000_s1047" style="position:absolute;width:39603;height:31215;visibility:visible;mso-wrap-style:square;v-text-anchor:middle" o:gfxdata="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" filled="f" strokecolor="white [3212]" strokeweight="1pt"/>
+                  <v:shape id="Image 1224332929" o:spid="_x0000_s1048" type="#_x0000_t75" style="position:absolute;left:1419;top:1367;width:36455;height:18396;visibility:visible;mso-wrap-style:square" o:gfxdata="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">
                     <v:imagedata r:id="rId11" o:title="" cropbottom="8947f" cropleft="21173f" cropright="21229f"/>
                   </v:shape>
-                  <v:shape id="Image 1511511444" o:spid="_x0000_s1049" type="#_x0000_t75" style="position:absolute;left:31250;top:21793;width:7200;height:7200;visibility:visible;mso-wrap-style:square" o:gfxdata="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">
+                  <v:shape id="Image 2081353947" o:spid="_x0000_s1049" type="#_x0000_t75" style="position:absolute;left:31250;top:21793;width:7200;height:7200;visibility:visible;mso-wrap-style:square" o:gfxdata="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">
                     <v:imagedata r:id="rId12" o:title="" gain="19661f" blacklevel="22938f"/>
                   </v:shape>
-                  <v:shape id="Image 1708396343" o:spid="_x0000_s1050" type="#_x0000_t75" style="position:absolute;left:1918;top:874;width:7200;height:7200;flip:x;visibility:visible;mso-wrap-style:square" o:gfxdata="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">
+                  <v:shape id="Image 154776276" o:spid="_x0000_s1050" type="#_x0000_t75" style="position:absolute;left:1918;top:874;width:7200;height:7200;flip:x;visibility:visible;mso-wrap-style:square" o:gfxdata="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">
                     <v:imagedata r:id="rId12" o:title="" gain="19661f" blacklevel="22938f"/>
                   </v:shape>
-                  <v:shape id="Image 904778424" o:spid="_x0000_s1051" type="#_x0000_t75" style="position:absolute;left:1503;top:21096;width:29445;height:8629;visibility:visible;mso-wrap-style:square" o:gfxdata="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">
-                    <v:imagedata r:id="rId13" o:title="" cropbottom="16734f" cropleft="23423f" cropright="23424f"/>
+                  <v:shape id="Image 391715152" o:spid="_x0000_s1051" type="#_x0000_t75" style="position:absolute;left:1417;top:20871;width:29833;height:8725;visibility:visible;mso-wrap-style:square" o:gfxdata="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">
+                    <v:imagedata r:id="rId13" o:title="" cropbottom="16037f" cropleft="23282f" cropright="23321f"/>
                   </v:shape>
                 </v:group>
                 <w10:anchorlock/>
@@ -3198,7 +3198,7 @@
         <w:gridCol w:w="1495"/>
         <w:gridCol w:w="827"/>
         <w:gridCol w:w="285"/>
-        <w:gridCol w:w="827"/>
+        <w:gridCol w:w="900"/>
         <w:gridCol w:w="827"/>
       </w:tblGrid>
       <w:tr>
@@ -3343,7 +3343,7 @@
                 <w:sz w:val="16"/>
                 <w:szCs w:val="16"/>
               </w:rPr>
-              <w:t>Cimetière</w:t>
+              <w:t>Intendance</w:t>
             </w:r>
           </w:p>
         </w:tc>

</xml_diff>

<commit_message>
Mise à jour des règles et polissage
</commit_message>
<xml_diff>
--- a/pictures/Memos/memos-fr.docx
+++ b/pictures/Memos/memos-fr.docx
@@ -14,7 +14,7 @@
         <mc:AlternateContent>
           <mc:Choice Requires="wpc">
             <w:drawing>
-              <wp:inline distT="0" distB="0" distL="0" distR="0" wp14:anchorId="3F35520E" wp14:editId="155FD109">
+              <wp:inline distT="0" distB="0" distL="0" distR="0" wp14:anchorId="3F35520E" wp14:editId="710A49EA">
                 <wp:extent cx="10276840" cy="7200900"/>
                 <wp:effectExtent l="0" t="0" r="0" b="0"/>
                 <wp:docPr id="1879269446" name="Zone de dessin 1"/>
@@ -32,13 +32,13 @@
                       </wpc:bg>
                       <wpc:whole/>
                       <wpg:wgp>
-                        <wpg:cNvPr id="562816355" name="Groupe 562816355"/>
+                        <wpg:cNvPr id="609151317" name="Groupe 609151317"/>
                         <wpg:cNvGrpSpPr/>
                         <wpg:grpSpPr>
                           <a:xfrm>
-                            <a:off x="655946" y="401744"/>
+                            <a:off x="5136812" y="417961"/>
                             <a:ext cx="3960390" cy="3121564"/>
-                            <a:chOff x="489692" y="314326"/>
+                            <a:chOff x="655946" y="401744"/>
                             <a:chExt cx="3960390" cy="3121564"/>
                           </a:xfrm>
                         </wpg:grpSpPr>
@@ -47,7 +47,7 @@
                           <wps:cNvSpPr/>
                           <wps:spPr>
                             <a:xfrm>
-                              <a:off x="489692" y="314326"/>
+                              <a:off x="655946" y="401744"/>
                               <a:ext cx="3960390" cy="3121564"/>
                             </a:xfrm>
                             <a:prstGeom prst="rect">
@@ -105,7 +105,7 @@
                           </pic:blipFill>
                           <pic:spPr bwMode="auto">
                             <a:xfrm>
-                              <a:off x="631592" y="451116"/>
+                              <a:off x="797846" y="538534"/>
                               <a:ext cx="3645535" cy="1839595"/>
                             </a:xfrm>
                             <a:prstGeom prst="rect">
@@ -145,7 +145,7 @@
                           </pic:blipFill>
                           <pic:spPr bwMode="auto">
                             <a:xfrm>
-                              <a:off x="3614720" y="2493672"/>
+                              <a:off x="3780974" y="2581090"/>
                               <a:ext cx="719992" cy="720000"/>
                             </a:xfrm>
                             <a:prstGeom prst="rect">
@@ -180,7 +180,7 @@
                           </pic:blipFill>
                           <pic:spPr bwMode="auto">
                             <a:xfrm flipH="1">
-                              <a:off x="681555" y="401744"/>
+                              <a:off x="847809" y="489162"/>
                               <a:ext cx="719991" cy="720000"/>
                             </a:xfrm>
                             <a:prstGeom prst="rect">
@@ -194,7 +194,7 @@
                         </pic:pic>
                         <pic:pic xmlns:pic="http://schemas.openxmlformats.org/drawingml/2006/picture">
                           <pic:nvPicPr>
-                            <pic:cNvPr id="1674944933" name="Image 1674944933"/>
+                            <pic:cNvPr id="1267767520" name="Image 1267767520"/>
                             <pic:cNvPicPr>
                               <a:picLocks noChangeAspect="1"/>
                             </pic:cNvPicPr>
@@ -207,15 +207,15 @@
                                 </a:ext>
                               </a:extLst>
                             </a:blip>
-                            <a:srcRect l="35526" r="35585" b="24471"/>
+                            <a:srcRect l="35373" r="35464" b="24411"/>
                             <a:stretch>
                               <a:fillRect/>
                             </a:stretch>
                           </pic:blipFill>
                           <pic:spPr bwMode="auto">
                             <a:xfrm>
-                              <a:off x="631490" y="2401523"/>
-                              <a:ext cx="2983230" cy="872490"/>
+                              <a:off x="797722" y="2515306"/>
+                              <a:ext cx="3011805" cy="873125"/>
                             </a:xfrm>
                             <a:prstGeom prst="rect">
                               <a:avLst/>
@@ -233,18 +233,18 @@
                         </pic:pic>
                       </wpg:wgp>
                       <wpg:wgp>
-                        <wpg:cNvPr id="1867465117" name="Groupe 1867465117"/>
+                        <wpg:cNvPr id="1440649281" name="Groupe 1440649281"/>
                         <wpg:cNvGrpSpPr/>
                         <wpg:grpSpPr>
                           <a:xfrm>
-                            <a:off x="4986198" y="401744"/>
+                            <a:off x="856800" y="418500"/>
                             <a:ext cx="3959860" cy="3121025"/>
                             <a:chOff x="0" y="0"/>
                             <a:chExt cx="3960390" cy="3121564"/>
                           </a:xfrm>
                         </wpg:grpSpPr>
                         <wps:wsp>
-                          <wps:cNvPr id="727798100" name="Rectangle 727798100"/>
+                          <wps:cNvPr id="187193218" name="Rectangle 187193218"/>
                           <wps:cNvSpPr/>
                           <wps:spPr>
                             <a:xfrm>
@@ -286,7 +286,7 @@
                         </wps:wsp>
                         <pic:pic xmlns:pic="http://schemas.openxmlformats.org/drawingml/2006/picture">
                           <pic:nvPicPr>
-                            <pic:cNvPr id="123798800" name="Image 123798800"/>
+                            <pic:cNvPr id="1236475616" name="Image 1236475616"/>
                             <pic:cNvPicPr>
                               <a:picLocks noChangeAspect="1"/>
                             </pic:cNvPicPr>
@@ -325,7 +325,7 @@
                         </pic:pic>
                         <pic:pic xmlns:pic="http://schemas.openxmlformats.org/drawingml/2006/picture">
                           <pic:nvPicPr>
-                            <pic:cNvPr id="1707400807" name="Image 1707400807"/>
+                            <pic:cNvPr id="935846693" name="Image 935846693"/>
                             <pic:cNvPicPr>
                               <a:picLocks noChangeAspect="1"/>
                             </pic:cNvPicPr>
@@ -360,7 +360,7 @@
                         </pic:pic>
                         <pic:pic xmlns:pic="http://schemas.openxmlformats.org/drawingml/2006/picture">
                           <pic:nvPicPr>
-                            <pic:cNvPr id="1766203803" name="Image 1766203803"/>
+                            <pic:cNvPr id="1244148021" name="Image 1244148021"/>
                             <pic:cNvPicPr>
                               <a:picLocks noChangeAspect="1"/>
                             </pic:cNvPicPr>
@@ -395,7 +395,7 @@
                         </pic:pic>
                         <pic:pic xmlns:pic="http://schemas.openxmlformats.org/drawingml/2006/picture">
                           <pic:nvPicPr>
-                            <pic:cNvPr id="833253042" name="Image 833253042"/>
+                            <pic:cNvPr id="1747045246" name="Image 1747045246"/>
                             <pic:cNvPicPr>
                               <a:picLocks noChangeAspect="1"/>
                             </pic:cNvPicPr>
@@ -408,15 +408,15 @@
                                 </a:ext>
                               </a:extLst>
                             </a:blip>
-                            <a:srcRect l="35526" r="35585" b="24471"/>
+                            <a:srcRect l="35373" r="35464" b="24411"/>
                             <a:stretch>
                               <a:fillRect/>
                             </a:stretch>
                           </pic:blipFill>
                           <pic:spPr bwMode="auto">
                             <a:xfrm>
-                              <a:off x="141798" y="2087197"/>
-                              <a:ext cx="2983230" cy="872490"/>
+                              <a:off x="141776" y="2113562"/>
+                              <a:ext cx="3011805" cy="873125"/>
                             </a:xfrm>
                             <a:prstGeom prst="rect">
                               <a:avLst/>
@@ -434,18 +434,18 @@
                         </pic:pic>
                       </wpg:wgp>
                       <wpg:wgp>
-                        <wpg:cNvPr id="1409561989" name="Groupe 1409561989"/>
+                        <wpg:cNvPr id="609507454" name="Groupe 609507454"/>
                         <wpg:cNvGrpSpPr/>
                         <wpg:grpSpPr>
                           <a:xfrm>
-                            <a:off x="656476" y="3681736"/>
+                            <a:off x="856800" y="3735246"/>
                             <a:ext cx="3959860" cy="3121025"/>
                             <a:chOff x="0" y="0"/>
                             <a:chExt cx="3960390" cy="3121564"/>
                           </a:xfrm>
                         </wpg:grpSpPr>
                         <wps:wsp>
-                          <wps:cNvPr id="1577563644" name="Rectangle 1577563644"/>
+                          <wps:cNvPr id="1153455805" name="Rectangle 1153455805"/>
                           <wps:cNvSpPr/>
                           <wps:spPr>
                             <a:xfrm>
@@ -487,7 +487,7 @@
                         </wps:wsp>
                         <pic:pic xmlns:pic="http://schemas.openxmlformats.org/drawingml/2006/picture">
                           <pic:nvPicPr>
-                            <pic:cNvPr id="1745408490" name="Image 1745408490"/>
+                            <pic:cNvPr id="1622396369" name="Image 1622396369"/>
                             <pic:cNvPicPr>
                               <a:picLocks noChangeAspect="1"/>
                             </pic:cNvPicPr>
@@ -526,7 +526,7 @@
                         </pic:pic>
                         <pic:pic xmlns:pic="http://schemas.openxmlformats.org/drawingml/2006/picture">
                           <pic:nvPicPr>
-                            <pic:cNvPr id="1304375466" name="Image 1304375466"/>
+                            <pic:cNvPr id="629025070" name="Image 629025070"/>
                             <pic:cNvPicPr>
                               <a:picLocks noChangeAspect="1"/>
                             </pic:cNvPicPr>
@@ -561,7 +561,7 @@
                         </pic:pic>
                         <pic:pic xmlns:pic="http://schemas.openxmlformats.org/drawingml/2006/picture">
                           <pic:nvPicPr>
-                            <pic:cNvPr id="2078628494" name="Image 2078628494"/>
+                            <pic:cNvPr id="1605860837" name="Image 1605860837"/>
                             <pic:cNvPicPr>
                               <a:picLocks noChangeAspect="1"/>
                             </pic:cNvPicPr>
@@ -596,7 +596,7 @@
                         </pic:pic>
                         <pic:pic xmlns:pic="http://schemas.openxmlformats.org/drawingml/2006/picture">
                           <pic:nvPicPr>
-                            <pic:cNvPr id="2076241946" name="Image 2076241946"/>
+                            <pic:cNvPr id="1981304600" name="Image 1981304600"/>
                             <pic:cNvPicPr>
                               <a:picLocks noChangeAspect="1"/>
                             </pic:cNvPicPr>
@@ -609,15 +609,15 @@
                                 </a:ext>
                               </a:extLst>
                             </a:blip>
-                            <a:srcRect l="35526" r="35585" b="24471"/>
+                            <a:srcRect l="35373" r="35464" b="24411"/>
                             <a:stretch>
                               <a:fillRect/>
                             </a:stretch>
                           </pic:blipFill>
                           <pic:spPr bwMode="auto">
                             <a:xfrm>
-                              <a:off x="141798" y="2087197"/>
-                              <a:ext cx="2983230" cy="872490"/>
+                              <a:off x="141776" y="2113562"/>
+                              <a:ext cx="3011805" cy="873125"/>
                             </a:xfrm>
                             <a:prstGeom prst="rect">
                               <a:avLst/>
@@ -635,18 +635,18 @@
                         </pic:pic>
                       </wpg:wgp>
                       <wpg:wgp>
-                        <wpg:cNvPr id="1566720209" name="Groupe 1566720209"/>
+                        <wpg:cNvPr id="1060422327" name="Groupe 1060422327"/>
                         <wpg:cNvGrpSpPr/>
                         <wpg:grpSpPr>
                           <a:xfrm>
-                            <a:off x="4996589" y="3681736"/>
+                            <a:off x="5167639" y="3735246"/>
                             <a:ext cx="3959860" cy="3121025"/>
                             <a:chOff x="0" y="0"/>
                             <a:chExt cx="3960390" cy="3121564"/>
                           </a:xfrm>
                         </wpg:grpSpPr>
                         <wps:wsp>
-                          <wps:cNvPr id="1919753086" name="Rectangle 1919753086"/>
+                          <wps:cNvPr id="1101234941" name="Rectangle 1101234941"/>
                           <wps:cNvSpPr/>
                           <wps:spPr>
                             <a:xfrm>
@@ -688,7 +688,7 @@
                         </wps:wsp>
                         <pic:pic xmlns:pic="http://schemas.openxmlformats.org/drawingml/2006/picture">
                           <pic:nvPicPr>
-                            <pic:cNvPr id="1224332929" name="Image 1224332929"/>
+                            <pic:cNvPr id="437557493" name="Image 437557493"/>
                             <pic:cNvPicPr>
                               <a:picLocks noChangeAspect="1"/>
                             </pic:cNvPicPr>
@@ -727,7 +727,7 @@
                         </pic:pic>
                         <pic:pic xmlns:pic="http://schemas.openxmlformats.org/drawingml/2006/picture">
                           <pic:nvPicPr>
-                            <pic:cNvPr id="2081353947" name="Image 2081353947"/>
+                            <pic:cNvPr id="1928677400" name="Image 1928677400"/>
                             <pic:cNvPicPr>
                               <a:picLocks noChangeAspect="1"/>
                             </pic:cNvPicPr>
@@ -762,7 +762,7 @@
                         </pic:pic>
                         <pic:pic xmlns:pic="http://schemas.openxmlformats.org/drawingml/2006/picture">
                           <pic:nvPicPr>
-                            <pic:cNvPr id="154776276" name="Image 154776276"/>
+                            <pic:cNvPr id="345897998" name="Image 345897998"/>
                             <pic:cNvPicPr>
                               <a:picLocks noChangeAspect="1"/>
                             </pic:cNvPicPr>
@@ -797,7 +797,7 @@
                         </pic:pic>
                         <pic:pic xmlns:pic="http://schemas.openxmlformats.org/drawingml/2006/picture">
                           <pic:nvPicPr>
-                            <pic:cNvPr id="391715152" name="Image 391715152"/>
+                            <pic:cNvPr id="155482494" name="Image 155482494"/>
                             <pic:cNvPicPr>
                               <a:picLocks noChangeAspect="1"/>
                             </pic:cNvPicPr>
@@ -810,15 +810,15 @@
                                 </a:ext>
                               </a:extLst>
                             </a:blip>
-                            <a:srcRect l="35526" r="35585" b="24471"/>
+                            <a:srcRect l="35373" r="35464" b="24411"/>
                             <a:stretch>
                               <a:fillRect/>
                             </a:stretch>
                           </pic:blipFill>
                           <pic:spPr bwMode="auto">
                             <a:xfrm>
-                              <a:off x="141798" y="2087197"/>
-                              <a:ext cx="2983230" cy="872490"/>
+                              <a:off x="141776" y="2113562"/>
+                              <a:ext cx="3011805" cy="873125"/>
                             </a:xfrm>
                             <a:prstGeom prst="rect">
                               <a:avLst/>
@@ -843,7 +843,7 @@
           </mc:Choice>
           <mc:Fallback>
             <w:pict>
-              <v:group w14:anchorId="1503CAA9" id="Zone de dessin 1" o:spid="_x0000_s1026" editas="canvas" style="width:809.2pt;height:567pt;mso-position-horizontal-relative:char;mso-position-vertical-relative:line" coordsize="102768,72009" o:gfxdata="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">
+              <v:group w14:anchorId="28EDB4DC" id="Zone de dessin 1" o:spid="_x0000_s1026" editas="canvas" style="width:809.2pt;height:567pt;mso-position-horizontal-relative:char;mso-position-vertical-relative:line" coordsize="102768,72009" o:gfxdata="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